<commit_message>
docs: remove internal artifacts and expand guide
</commit_message>
<xml_diff>
--- a/docs/Dericks-Skills-使用指南.docx
+++ b/docs/Dericks-Skills-使用指南.docx
@@ -1830,6 +1830,920 @@
         <w:t>會先在當前任務問你，不會把以前的同意當成這次同意。</w:t>
       </w:r>
     </w:p>
+    <w:p>
+      <w:r>
+        <w:br w:type="page"/>
+      </w:r>
+    </w:p>
+    <w:p>
+      <w:pPr>
+        <w:keepNext/>
+        <w:spacing w:before="360" w:after="180" w:line="264" w:lineRule="auto"/>
+      </w:pPr>
+      <w:r>
+        <w:rPr>
+          <w:rFonts w:ascii="Microsoft JhengHei" w:hAnsi="Microsoft JhengHei" w:eastAsia="Microsoft JhengHei"/>
+          <w:b/>
+          <w:color w:val="2E74B5"/>
+          <w:sz w:val="32"/>
+        </w:rPr>
+        <w:t>在 ChatGPT App 用 GUI 安裝與調用</w:t>
+      </w:r>
+    </w:p>
+    <w:p>
+      <w:pPr>
+        <w:spacing w:before="0" w:after="120" w:line="300" w:lineRule="auto"/>
+      </w:pPr>
+      <w:r>
+        <w:rPr>
+          <w:rFonts w:ascii="Microsoft JhengHei" w:hAnsi="Microsoft JhengHei" w:eastAsia="Microsoft JhengHei"/>
+          <w:b w:val="0"/>
+          <w:color w:val="17324D"/>
+          <w:sz w:val="22"/>
+        </w:rPr>
+        <w:t>不想使用命令列時，可在 ChatGPT App 的 Codex 工作區，以 GUI 加入 marketplace、安裝 plugin，再用 `$skill` 或自然語言需求開始新任務。不同 App 版本的按鈕名稱可能略有不同，請尋找 Plugins、Marketplaces 與 Add marketplace 等入口。</w:t>
+      </w:r>
+    </w:p>
+    <w:tbl>
+      <w:tblPr>
+        <w:tblStyle w:val="TableGrid"/>
+        <w:tblW w:type="auto" w:w="0"/>
+        <w:jc w:val="left"/>
+        <w:tblLayout w:type="fixed"/>
+        <w:tblLook w:firstColumn="1" w:firstRow="1" w:lastColumn="0" w:lastRow="0" w:noHBand="0" w:noVBand="1" w:val="04A0"/>
+      </w:tblPr>
+      <w:tblGrid>
+        <w:gridCol w:w="9360"/>
+      </w:tblGrid>
+      <w:tr>
+        <w:trPr>
+          <w:cantSplit/>
+        </w:trPr>
+        <w:tc>
+          <w:tcPr>
+            <w:tcW w:type="dxa" w:w="9360"/>
+            <w:vAlign w:val="center"/>
+            <w:shd w:fill="E8EEF5" w:val="clear"/>
+          </w:tcPr>
+          <w:p>
+            <w:pPr>
+              <w:spacing w:before="0" w:after="0" w:line="269" w:lineRule="auto"/>
+            </w:pPr>
+            <w:r>
+              <w:rPr>
+                <w:rFonts w:ascii="Microsoft JhengHei" w:hAnsi="Microsoft JhengHei" w:eastAsia="Microsoft JhengHei"/>
+                <w:b/>
+                <w:color w:val="1F4D78"/>
+                <w:sz w:val="21"/>
+              </w:rPr>
+              <w:t>建議使用本機資料夾 D:\codex-skills 作為 marketplace 來源；選取後應顯示 Derick's Skills。</w:t>
+            </w:r>
+          </w:p>
+        </w:tc>
+      </w:tr>
+    </w:tbl>
+    <w:p/>
+    <w:p>
+      <w:pPr>
+        <w:keepNext/>
+        <w:spacing w:before="240" w:after="180" w:line="264" w:lineRule="auto"/>
+      </w:pPr>
+      <w:r>
+        <w:rPr>
+          <w:rFonts w:ascii="Microsoft JhengHei" w:hAnsi="Microsoft JhengHei" w:eastAsia="Microsoft JhengHei"/>
+          <w:b/>
+          <w:color w:val="2E74B5"/>
+          <w:sz w:val="26"/>
+        </w:rPr>
+        <w:t>用 GUI 加入 marketplace</w:t>
+      </w:r>
+    </w:p>
+    <w:tbl>
+      <w:tblPr>
+        <w:tblStyle w:val="TableGrid"/>
+        <w:tblW w:type="auto" w:w="0"/>
+        <w:jc w:val="left"/>
+        <w:tblLayout w:type="fixed"/>
+        <w:tblLook w:firstColumn="1" w:firstRow="1" w:lastColumn="0" w:lastRow="0" w:noHBand="0" w:noVBand="1" w:val="04A0"/>
+      </w:tblPr>
+      <w:tblGrid>
+        <w:gridCol w:w="600"/>
+        <w:gridCol w:w="2400"/>
+        <w:gridCol w:w="6360"/>
+      </w:tblGrid>
+      <w:tr>
+        <w:trPr>
+          <w:cantSplit/>
+        </w:trPr>
+        <w:tc>
+          <w:tcPr>
+            <w:tcW w:type="dxa" w:w="600"/>
+            <w:vAlign w:val="center"/>
+            <w:shd w:fill="E8EEF5" w:val="clear"/>
+          </w:tcPr>
+          <w:p>
+            <w:pPr>
+              <w:spacing w:before="0" w:after="0" w:line="269" w:lineRule="auto"/>
+            </w:pPr>
+            <w:r>
+              <w:rPr>
+                <w:rFonts w:ascii="Microsoft JhengHei" w:hAnsi="Microsoft JhengHei" w:eastAsia="Microsoft JhengHei"/>
+                <w:b/>
+                <w:color w:val="1F4D78"/>
+                <w:sz w:val="20"/>
+              </w:rPr>
+              <w:t>步驟</w:t>
+            </w:r>
+          </w:p>
+        </w:tc>
+        <w:tc>
+          <w:tcPr>
+            <w:tcW w:type="dxa" w:w="2400"/>
+            <w:vAlign w:val="center"/>
+            <w:shd w:fill="E8EEF5" w:val="clear"/>
+          </w:tcPr>
+          <w:p>
+            <w:pPr>
+              <w:spacing w:before="0" w:after="0" w:line="269" w:lineRule="auto"/>
+            </w:pPr>
+            <w:r>
+              <w:rPr>
+                <w:rFonts w:ascii="Microsoft JhengHei" w:hAnsi="Microsoft JhengHei" w:eastAsia="Microsoft JhengHei"/>
+                <w:b/>
+                <w:color w:val="1F4D78"/>
+                <w:sz w:val="20"/>
+              </w:rPr>
+              <w:t>在 GUI 做什麼</w:t>
+            </w:r>
+          </w:p>
+        </w:tc>
+        <w:tc>
+          <w:tcPr>
+            <w:tcW w:type="dxa" w:w="6360"/>
+            <w:vAlign w:val="center"/>
+            <w:shd w:fill="E8EEF5" w:val="clear"/>
+          </w:tcPr>
+          <w:p>
+            <w:pPr>
+              <w:spacing w:before="0" w:after="0" w:line="269" w:lineRule="auto"/>
+            </w:pPr>
+            <w:r>
+              <w:rPr>
+                <w:rFonts w:ascii="Microsoft JhengHei" w:hAnsi="Microsoft JhengHei" w:eastAsia="Microsoft JhengHei"/>
+                <w:b/>
+                <w:color w:val="1F4D78"/>
+                <w:sz w:val="20"/>
+              </w:rPr>
+              <w:t>結果／注意事項</w:t>
+            </w:r>
+          </w:p>
+        </w:tc>
+      </w:tr>
+      <w:tr>
+        <w:trPr>
+          <w:cantSplit/>
+        </w:trPr>
+        <w:tc>
+          <w:tcPr>
+            <w:tcW w:type="dxa" w:w="600"/>
+            <w:vAlign w:val="center"/>
+          </w:tcPr>
+          <w:p>
+            <w:pPr>
+              <w:spacing w:before="0" w:after="0" w:line="269" w:lineRule="auto"/>
+            </w:pPr>
+            <w:r>
+              <w:rPr>
+                <w:rFonts w:ascii="Microsoft JhengHei" w:hAnsi="Microsoft JhengHei" w:eastAsia="Microsoft JhengHei"/>
+                <w:b/>
+                <w:color w:val="1F4D78"/>
+                <w:sz w:val="20"/>
+              </w:rPr>
+              <w:t>1</w:t>
+            </w:r>
+          </w:p>
+        </w:tc>
+        <w:tc>
+          <w:tcPr>
+            <w:tcW w:type="dxa" w:w="2400"/>
+            <w:vAlign w:val="center"/>
+          </w:tcPr>
+          <w:p>
+            <w:pPr>
+              <w:spacing w:before="0" w:after="0" w:line="269" w:lineRule="auto"/>
+            </w:pPr>
+            <w:r>
+              <w:rPr>
+                <w:rFonts w:ascii="Microsoft JhengHei" w:hAnsi="Microsoft JhengHei" w:eastAsia="Microsoft JhengHei"/>
+                <w:b/>
+                <w:color w:val="1F4D78"/>
+                <w:sz w:val="20"/>
+              </w:rPr>
+              <w:t>開啟 Codex</w:t>
+            </w:r>
+          </w:p>
+        </w:tc>
+        <w:tc>
+          <w:tcPr>
+            <w:tcW w:type="dxa" w:w="6360"/>
+            <w:vAlign w:val="center"/>
+          </w:tcPr>
+          <w:p>
+            <w:pPr>
+              <w:spacing w:before="0" w:after="0" w:line="269" w:lineRule="auto"/>
+            </w:pPr>
+            <w:r>
+              <w:rPr>
+                <w:rFonts w:ascii="Microsoft JhengHei" w:hAnsi="Microsoft JhengHei" w:eastAsia="Microsoft JhengHei"/>
+                <w:b w:val="0"/>
+                <w:color w:val="17324D"/>
+                <w:sz w:val="20"/>
+              </w:rPr>
+              <w:t>在 ChatGPT App 進入 Codex 工作區，開啟 Plugins 管理畫面。</w:t>
+            </w:r>
+          </w:p>
+        </w:tc>
+      </w:tr>
+      <w:tr>
+        <w:trPr>
+          <w:cantSplit/>
+        </w:trPr>
+        <w:tc>
+          <w:tcPr>
+            <w:tcW w:type="dxa" w:w="600"/>
+            <w:vAlign w:val="center"/>
+          </w:tcPr>
+          <w:p>
+            <w:pPr>
+              <w:spacing w:before="0" w:after="0" w:line="269" w:lineRule="auto"/>
+            </w:pPr>
+            <w:r>
+              <w:rPr>
+                <w:rFonts w:ascii="Microsoft JhengHei" w:hAnsi="Microsoft JhengHei" w:eastAsia="Microsoft JhengHei"/>
+                <w:b/>
+                <w:color w:val="1F4D78"/>
+                <w:sz w:val="20"/>
+              </w:rPr>
+              <w:t>2</w:t>
+            </w:r>
+          </w:p>
+        </w:tc>
+        <w:tc>
+          <w:tcPr>
+            <w:tcW w:type="dxa" w:w="2400"/>
+            <w:vAlign w:val="center"/>
+          </w:tcPr>
+          <w:p>
+            <w:pPr>
+              <w:spacing w:before="0" w:after="0" w:line="269" w:lineRule="auto"/>
+            </w:pPr>
+            <w:r>
+              <w:rPr>
+                <w:rFonts w:ascii="Microsoft JhengHei" w:hAnsi="Microsoft JhengHei" w:eastAsia="Microsoft JhengHei"/>
+                <w:b/>
+                <w:color w:val="1F4D78"/>
+                <w:sz w:val="20"/>
+              </w:rPr>
+              <w:t>新增 marketplace</w:t>
+            </w:r>
+          </w:p>
+        </w:tc>
+        <w:tc>
+          <w:tcPr>
+            <w:tcW w:type="dxa" w:w="6360"/>
+            <w:vAlign w:val="center"/>
+          </w:tcPr>
+          <w:p>
+            <w:pPr>
+              <w:spacing w:before="0" w:after="0" w:line="269" w:lineRule="auto"/>
+            </w:pPr>
+            <w:r>
+              <w:rPr>
+                <w:rFonts w:ascii="Microsoft JhengHei" w:hAnsi="Microsoft JhengHei" w:eastAsia="Microsoft JhengHei"/>
+                <w:b w:val="0"/>
+                <w:color w:val="17324D"/>
+                <w:sz w:val="20"/>
+              </w:rPr>
+              <w:t>在 Marketplaces 區域選擇 Add marketplace（或加號）。</w:t>
+            </w:r>
+          </w:p>
+        </w:tc>
+      </w:tr>
+      <w:tr>
+        <w:trPr>
+          <w:cantSplit/>
+        </w:trPr>
+        <w:tc>
+          <w:tcPr>
+            <w:tcW w:type="dxa" w:w="600"/>
+            <w:vAlign w:val="center"/>
+          </w:tcPr>
+          <w:p>
+            <w:pPr>
+              <w:spacing w:before="0" w:after="0" w:line="269" w:lineRule="auto"/>
+            </w:pPr>
+            <w:r>
+              <w:rPr>
+                <w:rFonts w:ascii="Microsoft JhengHei" w:hAnsi="Microsoft JhengHei" w:eastAsia="Microsoft JhengHei"/>
+                <w:b/>
+                <w:color w:val="1F4D78"/>
+                <w:sz w:val="20"/>
+              </w:rPr>
+              <w:t>3</w:t>
+            </w:r>
+          </w:p>
+        </w:tc>
+        <w:tc>
+          <w:tcPr>
+            <w:tcW w:type="dxa" w:w="2400"/>
+            <w:vAlign w:val="center"/>
+          </w:tcPr>
+          <w:p>
+            <w:pPr>
+              <w:spacing w:before="0" w:after="0" w:line="269" w:lineRule="auto"/>
+            </w:pPr>
+            <w:r>
+              <w:rPr>
+                <w:rFonts w:ascii="Microsoft JhengHei" w:hAnsi="Microsoft JhengHei" w:eastAsia="Microsoft JhengHei"/>
+                <w:b/>
+                <w:color w:val="1F4D78"/>
+                <w:sz w:val="20"/>
+              </w:rPr>
+              <w:t>選擇來源</w:t>
+            </w:r>
+          </w:p>
+        </w:tc>
+        <w:tc>
+          <w:tcPr>
+            <w:tcW w:type="dxa" w:w="6360"/>
+            <w:vAlign w:val="center"/>
+          </w:tcPr>
+          <w:p>
+            <w:pPr>
+              <w:spacing w:before="0" w:after="0" w:line="269" w:lineRule="auto"/>
+            </w:pPr>
+            <w:r>
+              <w:rPr>
+                <w:rFonts w:ascii="Microsoft JhengHei" w:hAnsi="Microsoft JhengHei" w:eastAsia="Microsoft JhengHei"/>
+                <w:b w:val="0"/>
+                <w:color w:val="17324D"/>
+                <w:sz w:val="20"/>
+              </w:rPr>
+              <w:t>選擇本機資料夾作為來源，指定 D:\codex-skills。</w:t>
+            </w:r>
+          </w:p>
+        </w:tc>
+      </w:tr>
+      <w:tr>
+        <w:trPr>
+          <w:cantSplit/>
+        </w:trPr>
+        <w:tc>
+          <w:tcPr>
+            <w:tcW w:type="dxa" w:w="600"/>
+            <w:vAlign w:val="center"/>
+          </w:tcPr>
+          <w:p>
+            <w:pPr>
+              <w:spacing w:before="0" w:after="0" w:line="269" w:lineRule="auto"/>
+            </w:pPr>
+            <w:r>
+              <w:rPr>
+                <w:rFonts w:ascii="Microsoft JhengHei" w:hAnsi="Microsoft JhengHei" w:eastAsia="Microsoft JhengHei"/>
+                <w:b/>
+                <w:color w:val="1F4D78"/>
+                <w:sz w:val="20"/>
+              </w:rPr>
+              <w:t>4</w:t>
+            </w:r>
+          </w:p>
+        </w:tc>
+        <w:tc>
+          <w:tcPr>
+            <w:tcW w:type="dxa" w:w="2400"/>
+            <w:vAlign w:val="center"/>
+          </w:tcPr>
+          <w:p>
+            <w:pPr>
+              <w:spacing w:before="0" w:after="0" w:line="269" w:lineRule="auto"/>
+            </w:pPr>
+            <w:r>
+              <w:rPr>
+                <w:rFonts w:ascii="Microsoft JhengHei" w:hAnsi="Microsoft JhengHei" w:eastAsia="Microsoft JhengHei"/>
+                <w:b/>
+                <w:color w:val="1F4D78"/>
+                <w:sz w:val="20"/>
+              </w:rPr>
+              <w:t>確認市場</w:t>
+            </w:r>
+          </w:p>
+        </w:tc>
+        <w:tc>
+          <w:tcPr>
+            <w:tcW w:type="dxa" w:w="6360"/>
+            <w:vAlign w:val="center"/>
+          </w:tcPr>
+          <w:p>
+            <w:pPr>
+              <w:spacing w:before="0" w:after="0" w:line="269" w:lineRule="auto"/>
+            </w:pPr>
+            <w:r>
+              <w:rPr>
+                <w:rFonts w:ascii="Microsoft JhengHei" w:hAnsi="Microsoft JhengHei" w:eastAsia="Microsoft JhengHei"/>
+                <w:b w:val="0"/>
+                <w:color w:val="17324D"/>
+                <w:sz w:val="20"/>
+              </w:rPr>
+              <w:t>確認清單名稱為 Derick's Skills，再開啟其中的 plugin 清單。</w:t>
+            </w:r>
+          </w:p>
+        </w:tc>
+      </w:tr>
+      <w:tr>
+        <w:trPr>
+          <w:cantSplit/>
+        </w:trPr>
+        <w:tc>
+          <w:tcPr>
+            <w:tcW w:type="dxa" w:w="600"/>
+            <w:vAlign w:val="center"/>
+          </w:tcPr>
+          <w:p>
+            <w:pPr>
+              <w:spacing w:before="0" w:after="0" w:line="269" w:lineRule="auto"/>
+            </w:pPr>
+            <w:r>
+              <w:rPr>
+                <w:rFonts w:ascii="Microsoft JhengHei" w:hAnsi="Microsoft JhengHei" w:eastAsia="Microsoft JhengHei"/>
+                <w:b/>
+                <w:color w:val="1F4D78"/>
+                <w:sz w:val="20"/>
+              </w:rPr>
+              <w:t>5</w:t>
+            </w:r>
+          </w:p>
+        </w:tc>
+        <w:tc>
+          <w:tcPr>
+            <w:tcW w:type="dxa" w:w="2400"/>
+            <w:vAlign w:val="center"/>
+          </w:tcPr>
+          <w:p>
+            <w:pPr>
+              <w:spacing w:before="0" w:after="0" w:line="269" w:lineRule="auto"/>
+            </w:pPr>
+            <w:r>
+              <w:rPr>
+                <w:rFonts w:ascii="Microsoft JhengHei" w:hAnsi="Microsoft JhengHei" w:eastAsia="Microsoft JhengHei"/>
+                <w:b/>
+                <w:color w:val="1F4D78"/>
+                <w:sz w:val="20"/>
+              </w:rPr>
+              <w:t>安裝 plugin</w:t>
+            </w:r>
+          </w:p>
+        </w:tc>
+        <w:tc>
+          <w:tcPr>
+            <w:tcW w:type="dxa" w:w="6360"/>
+            <w:vAlign w:val="center"/>
+          </w:tcPr>
+          <w:p>
+            <w:pPr>
+              <w:spacing w:before="0" w:after="0" w:line="269" w:lineRule="auto"/>
+            </w:pPr>
+            <w:r>
+              <w:rPr>
+                <w:rFonts w:ascii="Microsoft JhengHei" w:hAnsi="Microsoft JhengHei" w:eastAsia="Microsoft JhengHei"/>
+                <w:b w:val="0"/>
+                <w:color w:val="17324D"/>
+                <w:sz w:val="20"/>
+              </w:rPr>
+              <w:t>選擇需要的 plugin，按 Install；可分別安裝 Word Render、UI 操作說明書、UI 操作說明書 Lite、UI Diagrams、Mantis Excel 更新。</w:t>
+            </w:r>
+          </w:p>
+        </w:tc>
+      </w:tr>
+      <w:tr>
+        <w:trPr>
+          <w:cantSplit/>
+        </w:trPr>
+        <w:tc>
+          <w:tcPr>
+            <w:tcW w:type="dxa" w:w="600"/>
+            <w:vAlign w:val="center"/>
+          </w:tcPr>
+          <w:p>
+            <w:pPr>
+              <w:spacing w:before="0" w:after="0" w:line="269" w:lineRule="auto"/>
+            </w:pPr>
+            <w:r>
+              <w:rPr>
+                <w:rFonts w:ascii="Microsoft JhengHei" w:hAnsi="Microsoft JhengHei" w:eastAsia="Microsoft JhengHei"/>
+                <w:b/>
+                <w:color w:val="1F4D78"/>
+                <w:sz w:val="20"/>
+              </w:rPr>
+              <w:t>6</w:t>
+            </w:r>
+          </w:p>
+        </w:tc>
+        <w:tc>
+          <w:tcPr>
+            <w:tcW w:type="dxa" w:w="2400"/>
+            <w:vAlign w:val="center"/>
+          </w:tcPr>
+          <w:p>
+            <w:pPr>
+              <w:spacing w:before="0" w:after="0" w:line="269" w:lineRule="auto"/>
+            </w:pPr>
+            <w:r>
+              <w:rPr>
+                <w:rFonts w:ascii="Microsoft JhengHei" w:hAnsi="Microsoft JhengHei" w:eastAsia="Microsoft JhengHei"/>
+                <w:b/>
+                <w:color w:val="1F4D78"/>
+                <w:sz w:val="20"/>
+              </w:rPr>
+              <w:t>開新任務</w:t>
+            </w:r>
+          </w:p>
+        </w:tc>
+        <w:tc>
+          <w:tcPr>
+            <w:tcW w:type="dxa" w:w="6360"/>
+            <w:vAlign w:val="center"/>
+          </w:tcPr>
+          <w:p>
+            <w:pPr>
+              <w:spacing w:before="0" w:after="0" w:line="269" w:lineRule="auto"/>
+            </w:pPr>
+            <w:r>
+              <w:rPr>
+                <w:rFonts w:ascii="Microsoft JhengHei" w:hAnsi="Microsoft JhengHei" w:eastAsia="Microsoft JhengHei"/>
+                <w:b w:val="0"/>
+                <w:color w:val="17324D"/>
+                <w:sz w:val="20"/>
+              </w:rPr>
+              <w:t>安裝或更新後另開一個 Codex 任務，讓新的 skill 定義確實載入。</w:t>
+            </w:r>
+          </w:p>
+        </w:tc>
+      </w:tr>
+    </w:tbl>
+    <w:p/>
+    <w:p>
+      <w:r>
+        <w:br w:type="page"/>
+      </w:r>
+    </w:p>
+    <w:p>
+      <w:pPr>
+        <w:keepNext/>
+        <w:spacing w:before="360" w:after="180" w:line="264" w:lineRule="auto"/>
+      </w:pPr>
+      <w:r>
+        <w:rPr>
+          <w:rFonts w:ascii="Microsoft JhengHei" w:hAnsi="Microsoft JhengHei" w:eastAsia="Microsoft JhengHei"/>
+          <w:b/>
+          <w:color w:val="2E74B5"/>
+          <w:sz w:val="32"/>
+        </w:rPr>
+        <w:t>安裝後怎麼調用</w:t>
+      </w:r>
+    </w:p>
+    <w:p>
+      <w:pPr>
+        <w:spacing w:before="0" w:after="100" w:line="300" w:lineRule="auto"/>
+      </w:pPr>
+      <w:r>
+        <w:rPr>
+          <w:rFonts w:ascii="Microsoft JhengHei" w:hAnsi="Microsoft JhengHei" w:eastAsia="Microsoft JhengHei"/>
+          <w:b/>
+          <w:color w:val="1F4D78"/>
+          <w:sz w:val="22"/>
+        </w:rPr>
+        <w:t>最簡單的方式：</w:t>
+      </w:r>
+      <w:r>
+        <w:rPr>
+          <w:rFonts w:ascii="Microsoft JhengHei" w:hAnsi="Microsoft JhengHei" w:eastAsia="Microsoft JhengHei"/>
+          <w:b w:val="0"/>
+          <w:color w:val="17324D"/>
+          <w:sz w:val="22"/>
+        </w:rPr>
+        <w:t>在新任務直接描述你要完成的事；需要明確指定時，則在提示詞內寫 `$skill`。</w:t>
+      </w:r>
+    </w:p>
+    <w:tbl>
+      <w:tblPr>
+        <w:tblStyle w:val="TableGrid"/>
+        <w:tblW w:type="auto" w:w="0"/>
+        <w:jc w:val="left"/>
+        <w:tblLayout w:type="fixed"/>
+        <w:tblLook w:firstColumn="1" w:firstRow="1" w:lastColumn="0" w:lastRow="0" w:noHBand="0" w:noVBand="1" w:val="04A0"/>
+      </w:tblPr>
+      <w:tblGrid>
+        <w:gridCol w:w="2800"/>
+        <w:gridCol w:w="6560"/>
+      </w:tblGrid>
+      <w:tr>
+        <w:trPr>
+          <w:cantSplit/>
+        </w:trPr>
+        <w:tc>
+          <w:tcPr>
+            <w:tcW w:type="dxa" w:w="2800"/>
+            <w:vAlign w:val="center"/>
+            <w:shd w:fill="E8EEF5" w:val="clear"/>
+          </w:tcPr>
+          <w:p>
+            <w:pPr>
+              <w:spacing w:before="0" w:after="0" w:line="269" w:lineRule="auto"/>
+            </w:pPr>
+            <w:r>
+              <w:rPr>
+                <w:rFonts w:ascii="Microsoft JhengHei" w:hAnsi="Microsoft JhengHei" w:eastAsia="Microsoft JhengHei"/>
+                <w:b/>
+                <w:color w:val="1F4D78"/>
+                <w:sz w:val="20"/>
+              </w:rPr>
+              <w:t>呼叫</w:t>
+            </w:r>
+          </w:p>
+        </w:tc>
+        <w:tc>
+          <w:tcPr>
+            <w:tcW w:type="dxa" w:w="6560"/>
+            <w:vAlign w:val="center"/>
+            <w:shd w:fill="E8EEF5" w:val="clear"/>
+          </w:tcPr>
+          <w:p>
+            <w:pPr>
+              <w:spacing w:before="0" w:after="0" w:line="269" w:lineRule="auto"/>
+            </w:pPr>
+            <w:r>
+              <w:rPr>
+                <w:rFonts w:ascii="Microsoft JhengHei" w:hAnsi="Microsoft JhengHei" w:eastAsia="Microsoft JhengHei"/>
+                <w:b/>
+                <w:color w:val="1F4D78"/>
+                <w:sz w:val="20"/>
+              </w:rPr>
+              <w:t>可直接貼上的提示</w:t>
+            </w:r>
+          </w:p>
+        </w:tc>
+      </w:tr>
+      <w:tr>
+        <w:trPr>
+          <w:cantSplit/>
+        </w:trPr>
+        <w:tc>
+          <w:tcPr>
+            <w:tcW w:type="dxa" w:w="2800"/>
+            <w:vAlign w:val="center"/>
+          </w:tcPr>
+          <w:p>
+            <w:pPr>
+              <w:spacing w:before="0" w:after="0" w:line="269" w:lineRule="auto"/>
+            </w:pPr>
+            <w:r>
+              <w:rPr>
+                <w:rFonts w:ascii="Consolas" w:hAnsi="Consolas" w:eastAsia="Microsoft JhengHei"/>
+                <w:b/>
+                <w:color w:val="1F4D78"/>
+                <w:sz w:val="20"/>
+              </w:rPr>
+              <w:t>$word-render</w:t>
+            </w:r>
+          </w:p>
+        </w:tc>
+        <w:tc>
+          <w:tcPr>
+            <w:tcW w:type="dxa" w:w="6560"/>
+            <w:vAlign w:val="center"/>
+          </w:tcPr>
+          <w:p>
+            <w:pPr>
+              <w:spacing w:before="0" w:after="0" w:line="269" w:lineRule="auto"/>
+            </w:pPr>
+            <w:r>
+              <w:rPr>
+                <w:rFonts w:ascii="Consolas" w:hAnsi="Consolas" w:eastAsia="Microsoft JhengHei"/>
+                <w:b w:val="0"/>
+                <w:color w:val="17324D"/>
+                <w:sz w:val="19"/>
+              </w:rPr>
+              <w:t>Use $word-render to render this DOCX with Word-first visual QA.</w:t>
+            </w:r>
+          </w:p>
+        </w:tc>
+      </w:tr>
+      <w:tr>
+        <w:trPr>
+          <w:cantSplit/>
+        </w:trPr>
+        <w:tc>
+          <w:tcPr>
+            <w:tcW w:type="dxa" w:w="2800"/>
+            <w:vAlign w:val="center"/>
+          </w:tcPr>
+          <w:p>
+            <w:pPr>
+              <w:spacing w:before="0" w:after="0" w:line="269" w:lineRule="auto"/>
+            </w:pPr>
+            <w:r>
+              <w:rPr>
+                <w:rFonts w:ascii="Consolas" w:hAnsi="Consolas" w:eastAsia="Microsoft JhengHei"/>
+                <w:b/>
+                <w:color w:val="1F4D78"/>
+                <w:sz w:val="20"/>
+              </w:rPr>
+              <w:t>$ui-guide</w:t>
+            </w:r>
+          </w:p>
+        </w:tc>
+        <w:tc>
+          <w:tcPr>
+            <w:tcW w:type="dxa" w:w="6560"/>
+            <w:vAlign w:val="center"/>
+          </w:tcPr>
+          <w:p>
+            <w:pPr>
+              <w:spacing w:before="0" w:after="0" w:line="269" w:lineRule="auto"/>
+            </w:pPr>
+            <w:r>
+              <w:rPr>
+                <w:rFonts w:ascii="Consolas" w:hAnsi="Consolas" w:eastAsia="Microsoft JhengHei"/>
+                <w:b w:val="0"/>
+                <w:color w:val="17324D"/>
+                <w:sz w:val="19"/>
+              </w:rPr>
+              <w:t>Use $ui-guide to create a UI 操作說明書；請加入訂單建立到審核的流程圖。</w:t>
+            </w:r>
+          </w:p>
+        </w:tc>
+      </w:tr>
+      <w:tr>
+        <w:trPr>
+          <w:cantSplit/>
+        </w:trPr>
+        <w:tc>
+          <w:tcPr>
+            <w:tcW w:type="dxa" w:w="2800"/>
+            <w:vAlign w:val="center"/>
+          </w:tcPr>
+          <w:p>
+            <w:pPr>
+              <w:spacing w:before="0" w:after="0" w:line="269" w:lineRule="auto"/>
+            </w:pPr>
+            <w:r>
+              <w:rPr>
+                <w:rFonts w:ascii="Consolas" w:hAnsi="Consolas" w:eastAsia="Microsoft JhengHei"/>
+                <w:b/>
+                <w:color w:val="1F4D78"/>
+                <w:sz w:val="20"/>
+              </w:rPr>
+              <w:t>$ui-guide-lite</w:t>
+            </w:r>
+          </w:p>
+        </w:tc>
+        <w:tc>
+          <w:tcPr>
+            <w:tcW w:type="dxa" w:w="6560"/>
+            <w:vAlign w:val="center"/>
+          </w:tcPr>
+          <w:p>
+            <w:pPr>
+              <w:spacing w:before="0" w:after="0" w:line="269" w:lineRule="auto"/>
+            </w:pPr>
+            <w:r>
+              <w:rPr>
+                <w:rFonts w:ascii="Consolas" w:hAnsi="Consolas" w:eastAsia="Microsoft JhengHei"/>
+                <w:b w:val="0"/>
+                <w:color w:val="17324D"/>
+                <w:sz w:val="19"/>
+              </w:rPr>
+              <w:t>Use $ui-guide-lite to create a UI 操作說明書；不需要 Word 視覺驗證。</w:t>
+            </w:r>
+          </w:p>
+        </w:tc>
+      </w:tr>
+      <w:tr>
+        <w:trPr>
+          <w:cantSplit/>
+        </w:trPr>
+        <w:tc>
+          <w:tcPr>
+            <w:tcW w:type="dxa" w:w="2800"/>
+            <w:vAlign w:val="center"/>
+          </w:tcPr>
+          <w:p>
+            <w:pPr>
+              <w:spacing w:before="0" w:after="0" w:line="269" w:lineRule="auto"/>
+            </w:pPr>
+            <w:r>
+              <w:rPr>
+                <w:rFonts w:ascii="Consolas" w:hAnsi="Consolas" w:eastAsia="Microsoft JhengHei"/>
+                <w:b/>
+                <w:color w:val="1F4D78"/>
+                <w:sz w:val="20"/>
+              </w:rPr>
+              <w:t>$mantis-excel-update</w:t>
+            </w:r>
+          </w:p>
+        </w:tc>
+        <w:tc>
+          <w:tcPr>
+            <w:tcW w:type="dxa" w:w="6560"/>
+            <w:vAlign w:val="center"/>
+          </w:tcPr>
+          <w:p>
+            <w:pPr>
+              <w:spacing w:before="0" w:after="0" w:line="269" w:lineRule="auto"/>
+            </w:pPr>
+            <w:r>
+              <w:rPr>
+                <w:rFonts w:ascii="Consolas" w:hAnsi="Consolas" w:eastAsia="Microsoft JhengHei"/>
+                <w:b w:val="0"/>
+                <w:color w:val="17324D"/>
+                <w:sz w:val="19"/>
+              </w:rPr>
+              <w:t>Use $mantis-excel-update to update this existing issue workbook from the latest Mantis CSV.</w:t>
+            </w:r>
+          </w:p>
+        </w:tc>
+      </w:tr>
+    </w:tbl>
+    <w:p/>
+    <w:p>
+      <w:pPr>
+        <w:spacing w:before="0" w:after="100" w:line="300" w:lineRule="auto"/>
+      </w:pPr>
+      <w:r>
+        <w:rPr>
+          <w:rFonts w:ascii="Microsoft JhengHei" w:hAnsi="Microsoft JhengHei" w:eastAsia="Microsoft JhengHei"/>
+          <w:b/>
+          <w:color w:val="1F4D78"/>
+          <w:sz w:val="22"/>
+        </w:rPr>
+        <w:t>UI Diagrams 的例外：</w:t>
+      </w:r>
+      <w:r>
+        <w:rPr>
+          <w:rFonts w:ascii="Microsoft JhengHei" w:hAnsi="Microsoft JhengHei" w:eastAsia="Microsoft JhengHei"/>
+          <w:b w:val="0"/>
+          <w:color w:val="17324D"/>
+          <w:sz w:val="22"/>
+        </w:rPr>
+        <w:t>一般不需直接叫 `$ui-diagrams`。在 `$ui-guide` 或 `$ui-guide-lite` 的需求寫「請加入流程圖／關係圖／架構圖」即可；父技能會在需要時檢查環境並交給它。截圖、紅框與游標標註不會觸發 UI Diagrams。</w:t>
+      </w:r>
+    </w:p>
+    <w:p>
+      <w:pPr>
+        <w:spacing w:before="0" w:after="100" w:line="300" w:lineRule="auto"/>
+      </w:pPr>
+      <w:r>
+        <w:rPr>
+          <w:rFonts w:ascii="Microsoft JhengHei" w:hAnsi="Microsoft JhengHei" w:eastAsia="Microsoft JhengHei"/>
+          <w:b/>
+          <w:color w:val="1F4D78"/>
+          <w:sz w:val="22"/>
+        </w:rPr>
+        <w:t>如果只想確認圖表環境：</w:t>
+      </w:r>
+      <w:r>
+        <w:rPr>
+          <w:rFonts w:ascii="Microsoft JhengHei" w:hAnsi="Microsoft JhengHei" w:eastAsia="Microsoft JhengHei"/>
+          <w:b w:val="0"/>
+          <w:color w:val="17324D"/>
+          <w:sz w:val="22"/>
+        </w:rPr>
+        <w:t>才直接說 `Use $ui-diagrams to check whether draw.io is ready.`；它只做依賴檢查與交接，不會自己產生圖檔。</w:t>
+      </w:r>
+    </w:p>
+    <w:p>
+      <w:pPr>
+        <w:spacing w:before="0" w:after="100" w:line="300" w:lineRule="auto"/>
+      </w:pPr>
+      <w:r>
+        <w:rPr>
+          <w:rFonts w:ascii="Microsoft JhengHei" w:hAnsi="Microsoft JhengHei" w:eastAsia="Microsoft JhengHei"/>
+          <w:b/>
+          <w:color w:val="1F4D78"/>
+          <w:sz w:val="22"/>
+        </w:rPr>
+        <w:t>使用 Mantis 替位符號：</w:t>
+      </w:r>
+      <w:r>
+        <w:rPr>
+          <w:rFonts w:ascii="Microsoft JhengHei" w:hAnsi="Microsoft JhengHei" w:eastAsia="Microsoft JhengHei"/>
+          <w:b w:val="0"/>
+          <w:color w:val="17324D"/>
+          <w:sz w:val="22"/>
+        </w:rPr>
+        <w:t>在 Excel 儲存格完整填入 `${...}` 自然語言規則；plugin 會先請你確認規則，再用它更新計算結果。</w:t>
+      </w:r>
+    </w:p>
     <w:sectPr>
       <w:headerReference w:type="default" r:id="rId9"/>
       <w:footerReference w:type="default" r:id="rId10"/>

</xml_diff>

<commit_message>
docs: add GitHub marketplace source
</commit_message>
<xml_diff>
--- a/docs/Dericks-Skills-使用指南.docx
+++ b/docs/Dericks-Skills-使用指南.docx
@@ -1894,9 +1894,9 @@
                 <w:rFonts w:ascii="Microsoft JhengHei" w:hAnsi="Microsoft JhengHei" w:eastAsia="Microsoft JhengHei"/>
                 <w:b/>
                 <w:color w:val="1F4D78"/>
-                <w:sz w:val="21"/>
+                <w:sz w:val="20"/>
               </w:rPr>
-              <w:t>建議使用本機資料夾 D:\codex-skills 作為 marketplace 來源；選取後應顯示 Derick's Skills。</w:t>
+              <w:t>可選本機資料夾 D:\codex-skills（立即驗證本機版本），或 GitHub repository：https://github.com/f00215a5/codex-skills.git（方便其他人安裝與同步）。</w:t>
             </w:r>
           </w:p>
         </w:tc>
@@ -2189,7 +2189,7 @@
                 <w:color w:val="17324D"/>
                 <w:sz w:val="20"/>
               </w:rPr>
-              <w:t>選擇本機資料夾作為來源，指定 D:\codex-skills。</w:t>
+              <w:t>選本機資料夾時指定 D:\codex-skills；選 GitHub repository 時輸入 https://github.com/f00215a5/codex-skills.git。</w:t>
             </w:r>
           </w:p>
         </w:tc>
@@ -2254,7 +2254,7 @@
                 <w:color w:val="17324D"/>
                 <w:sz w:val="20"/>
               </w:rPr>
-              <w:t>確認清單名稱為 Derick's Skills，再開啟其中的 plugin 清單。</w:t>
+              <w:t>本機或 GitHub 來源載入後，確認清單名稱為 Derick's Skills，再開啟其中的 plugin 清單。</w:t>
             </w:r>
           </w:p>
         </w:tc>

</xml_diff>

<commit_message>
docs: make usage paths portable
</commit_message>
<xml_diff>
--- a/docs/Dericks-Skills-使用指南.docx
+++ b/docs/Dericks-Skills-使用指南.docx
@@ -1239,138 +1239,14 @@
             <w:vAlign w:val="center"/>
           </w:tcPr>
           <w:p>
-            <w:pPr>
-              <w:spacing w:line="276" w:lineRule="auto"/>
-            </w:pPr>
             <w:r>
-              <w:rPr>
-                <w:rFonts w:ascii="Consolas" w:hAnsi="Consolas"/>
-                <w:color w:val="17324D"/>
-                <w:sz w:val="19"/>
-              </w:rPr>
-              <w:lastRenderedPageBreak/>
-              <w:t xml:space="preserve">Use $ui-guide to create a UI </w:t>
-            </w:r>
-            <w:r>
-              <w:rPr>
-                <w:rFonts w:ascii="Consolas" w:hAnsi="Consolas"/>
-                <w:color w:val="17324D"/>
-                <w:sz w:val="19"/>
-              </w:rPr>
-              <w:t>操作說明書。</w:t>
-            </w:r>
-            <w:r>
+              <w:t>Use $ui-guide to create a UI 操作說明書。</w:t>
               <w:br/>
-            </w:r>
-            <w:r>
-              <w:rPr>
-                <w:rFonts w:ascii="Consolas" w:hAnsi="Consolas"/>
-                <w:color w:val="17324D"/>
-                <w:sz w:val="19"/>
-              </w:rPr>
-              <w:t>目標畫面：</w:t>
-            </w:r>
-            <w:r>
-              <w:rPr>
-                <w:rFonts w:ascii="Consolas" w:hAnsi="Consolas"/>
-                <w:color w:val="17324D"/>
-                <w:sz w:val="19"/>
-              </w:rPr>
-              <w:t>/orders/create</w:t>
-            </w:r>
-            <w:r>
-              <w:rPr>
-                <w:rFonts w:ascii="Consolas" w:hAnsi="Consolas"/>
-                <w:color w:val="17324D"/>
-                <w:sz w:val="19"/>
-              </w:rPr>
-              <w:t>、</w:t>
-            </w:r>
-            <w:r>
-              <w:rPr>
-                <w:rFonts w:ascii="Consolas" w:hAnsi="Consolas"/>
-                <w:color w:val="17324D"/>
-                <w:sz w:val="19"/>
-              </w:rPr>
-              <w:t>/orders/list</w:t>
-            </w:r>
-            <w:r>
+              <w:t>目標畫面：/orders/create、/orders/list</w:t>
               <w:br/>
-            </w:r>
-            <w:r>
-              <w:rPr>
-                <w:rFonts w:ascii="Consolas" w:hAnsi="Consolas"/>
-                <w:color w:val="17324D"/>
-                <w:sz w:val="19"/>
-              </w:rPr>
-              <w:t>交付：訂單管理操作說明書</w:t>
-            </w:r>
-            <w:r>
-              <w:rPr>
-                <w:rFonts w:ascii="Consolas" w:hAnsi="Consolas"/>
-                <w:color w:val="17324D"/>
-                <w:sz w:val="19"/>
-              </w:rPr>
-              <w:t xml:space="preserve"> v1.0</w:t>
-            </w:r>
-            <w:r>
-              <w:rPr>
-                <w:rFonts w:ascii="Consolas" w:hAnsi="Consolas"/>
-                <w:color w:val="17324D"/>
-                <w:sz w:val="19"/>
-              </w:rPr>
-              <w:t>，輸出到</w:t>
-            </w:r>
-            <w:r>
-              <w:rPr>
-                <w:rFonts w:ascii="Consolas" w:hAnsi="Consolas"/>
-                <w:color w:val="17324D"/>
-                <w:sz w:val="19"/>
-              </w:rPr>
-              <w:t xml:space="preserve"> D:\deliverables</w:t>
-            </w:r>
-            <w:r>
+              <w:t>交付：訂單管理操作說明書 v1.0，輸出到 &lt;輸出資料夾&gt;</w:t>
               <w:br/>
-            </w:r>
-            <w:r>
-              <w:rPr>
-                <w:rFonts w:ascii="Consolas" w:hAnsi="Consolas"/>
-                <w:color w:val="17324D"/>
-                <w:sz w:val="19"/>
-              </w:rPr>
-              <w:t>我會提供前端</w:t>
-            </w:r>
-            <w:r>
-              <w:rPr>
-                <w:rFonts w:ascii="Consolas" w:hAnsi="Consolas"/>
-                <w:color w:val="17324D"/>
-                <w:sz w:val="19"/>
-              </w:rPr>
-              <w:t xml:space="preserve"> repository</w:t>
-            </w:r>
-            <w:r>
-              <w:rPr>
-                <w:rFonts w:ascii="Consolas" w:hAnsi="Consolas"/>
-                <w:color w:val="17324D"/>
-                <w:sz w:val="19"/>
-              </w:rPr>
-              <w:t>；後端</w:t>
-            </w:r>
-            <w:r>
-              <w:rPr>
-                <w:rFonts w:ascii="Consolas" w:hAnsi="Consolas"/>
-                <w:color w:val="17324D"/>
-                <w:sz w:val="19"/>
-              </w:rPr>
-              <w:t xml:space="preserve"> repository </w:t>
-            </w:r>
-            <w:r>
-              <w:rPr>
-                <w:rFonts w:ascii="Consolas" w:hAnsi="Consolas"/>
-                <w:color w:val="17324D"/>
-                <w:sz w:val="19"/>
-              </w:rPr>
-              <w:t>不提供。</w:t>
+              <w:t>我會提供前端 repository；後端 repository 不提供。</w:t>
             </w:r>
           </w:p>
         </w:tc>
@@ -1678,126 +1554,12 @@
             <w:vAlign w:val="center"/>
           </w:tcPr>
           <w:p>
-            <w:pPr>
-              <w:spacing w:line="276" w:lineRule="auto"/>
-            </w:pPr>
             <w:r>
-              <w:rPr>
-                <w:rFonts w:ascii="Consolas" w:hAnsi="Consolas"/>
-                <w:color w:val="17324D"/>
-                <w:sz w:val="19"/>
-              </w:rPr>
               <w:t>Use $mantis-excel-update to update my existing Mantis issue workbook.</w:t>
-            </w:r>
-            <w:r>
               <w:br/>
-            </w:r>
-            <w:r>
-              <w:rPr>
-                <w:rFonts w:ascii="Consolas" w:hAnsi="Consolas"/>
-                <w:color w:val="17324D"/>
-                <w:sz w:val="19"/>
-              </w:rPr>
-              <w:t>CSV</w:t>
-            </w:r>
-            <w:r>
-              <w:rPr>
-                <w:rFonts w:ascii="Consolas" w:hAnsi="Consolas"/>
-                <w:color w:val="17324D"/>
-                <w:sz w:val="19"/>
-              </w:rPr>
-              <w:t>：</w:t>
-            </w:r>
-            <w:r>
-              <w:rPr>
-                <w:rFonts w:ascii="Consolas" w:hAnsi="Consolas"/>
-                <w:color w:val="17324D"/>
-                <w:sz w:val="19"/>
-              </w:rPr>
-              <w:t xml:space="preserve">D:\input\mantis-latest.csv  </w:t>
-            </w:r>
-            <w:r>
-              <w:rPr>
-                <w:rFonts w:ascii="Consolas" w:hAnsi="Consolas"/>
-                <w:color w:val="17324D"/>
-                <w:sz w:val="19"/>
-              </w:rPr>
-              <w:t>｜</w:t>
-            </w:r>
-            <w:r>
-              <w:rPr>
-                <w:rFonts w:ascii="Consolas" w:hAnsi="Consolas"/>
-                <w:color w:val="17324D"/>
-                <w:sz w:val="19"/>
-              </w:rPr>
-              <w:t xml:space="preserve">  </w:t>
-            </w:r>
-            <w:r>
-              <w:rPr>
-                <w:rFonts w:ascii="Consolas" w:hAnsi="Consolas"/>
-                <w:color w:val="17324D"/>
-                <w:sz w:val="19"/>
-              </w:rPr>
-              <w:t>工作簿：</w:t>
-            </w:r>
-            <w:r>
-              <w:rPr>
-                <w:rFonts w:ascii="Consolas" w:hAnsi="Consolas"/>
-                <w:color w:val="17324D"/>
-                <w:sz w:val="19"/>
-              </w:rPr>
-              <w:t>D:\work\</w:t>
-            </w:r>
-            <w:r>
-              <w:rPr>
-                <w:rFonts w:ascii="Consolas" w:hAnsi="Consolas"/>
-                <w:color w:val="17324D"/>
-                <w:sz w:val="19"/>
-              </w:rPr>
-              <w:t>問題單</w:t>
-            </w:r>
-            <w:r>
-              <w:rPr>
-                <w:rFonts w:ascii="Consolas" w:hAnsi="Consolas"/>
-                <w:color w:val="17324D"/>
-                <w:sz w:val="19"/>
-              </w:rPr>
-              <w:t>.xlsx</w:t>
-            </w:r>
-            <w:r>
+              <w:t>CSV：&lt;CSV 檔案路徑&gt;  ｜  工作簿：&lt;既有 Excel 檔案路徑&gt;</w:t>
               <w:br/>
-            </w:r>
-            <w:r>
-              <w:rPr>
-                <w:rFonts w:ascii="Consolas" w:hAnsi="Consolas"/>
-                <w:color w:val="17324D"/>
-                <w:sz w:val="19"/>
-              </w:rPr>
-              <w:t>輸出：</w:t>
-            </w:r>
-            <w:r>
-              <w:rPr>
-                <w:rFonts w:ascii="Consolas" w:hAnsi="Consolas"/>
-                <w:color w:val="17324D"/>
-                <w:sz w:val="19"/>
-              </w:rPr>
-              <w:t>D:\deliverables\</w:t>
-            </w:r>
-            <w:r>
-              <w:rPr>
-                <w:rFonts w:ascii="Consolas" w:hAnsi="Consolas"/>
-                <w:color w:val="17324D"/>
-                <w:sz w:val="19"/>
-              </w:rPr>
-              <w:t>問題單</w:t>
-            </w:r>
-            <w:r>
-              <w:rPr>
-                <w:rFonts w:ascii="Consolas" w:hAnsi="Consolas"/>
-                <w:color w:val="17324D"/>
-                <w:sz w:val="19"/>
-              </w:rPr>
-              <w:t>-2026-08.xlsx</w:t>
+              <w:t>輸出：&lt;輸出 Excel 檔案路徑&gt;</w:t>
             </w:r>
           </w:p>
         </w:tc>
@@ -2079,34 +1841,8 @@
             <w:vAlign w:val="center"/>
           </w:tcPr>
           <w:p>
-            <w:pPr>
-              <w:spacing w:line="269" w:lineRule="auto"/>
-            </w:pPr>
             <w:r>
-              <w:rPr>
-                <w:b/>
-                <w:color w:val="1F4D78"/>
-                <w:sz w:val="20"/>
-              </w:rPr>
-              <w:t>可選本機資料夾 D:\codex-skills（</w:t>
-            </w:r>
-            <w:r>
-              <w:rPr>
-                <w:rFonts w:hint="eastAsia"/>
-                <w:b/>
-                <w:color w:val="1F4D78"/>
-                <w:sz w:val="20"/>
-                <w:lang w:eastAsia="zh-TW"/>
-              </w:rPr>
-              <w:t>依照實際存放位置調整</w:t>
-            </w:r>
-            <w:r>
-              <w:rPr>
-                <w:b/>
-                <w:color w:val="1F4D78"/>
-                <w:sz w:val="20"/>
-              </w:rPr>
-              <w:t>），或 GitHub repository：https://github.com/f00215a5/codex-skills.git（方便其他人安裝與同步）。</w:t>
+              <w:t>可選本機的 marketplace repository 根目錄（其中包含 marketplace.json），或 GitHub repository：https://github.com/f00215a5/codex-skills.git（方便其他人安裝與同步）。</w:t>
             </w:r>
           </w:p>
         </w:tc>
@@ -2425,15 +2161,8 @@
             <w:vAlign w:val="center"/>
           </w:tcPr>
           <w:p>
-            <w:pPr>
-              <w:spacing w:line="269" w:lineRule="auto"/>
-            </w:pPr>
             <w:r>
-              <w:rPr>
-                <w:color w:val="17324D"/>
-                <w:sz w:val="20"/>
-              </w:rPr>
-              <w:t>選本機資料夾時指定 D:\codex-skills；選 GitHub repository 時輸入 https://github.com/f00215a5/codex-skills.git。</w:t>
+              <w:t>選本機資料夾時，選擇你下載或 clone 的 marketplace repository 根目錄（其中應包含 marketplace.json）；選 GitHub repository 時輸入 https://github.com/f00215a5/codex-skills.git。</w:t>
             </w:r>
           </w:p>
         </w:tc>

</xml_diff>